<commit_message>
site: chapter header and page-numbered footer in every Word edition
The shared Word reference document (assets/reference-mslearn.docx),
used by the book bundles and the per-page .docx downloads, now has:
- a header with the current chapter or appendix name (a STYLEREF
  field on Heading 1, so it changes at each chapter);
- a footer with "Federal Modernization Workbook · <book title>" (a
  STYLEREF on the document Title, so it uses the book's topic name)
  and "Page X of Y";
- no header or footer on the title page.

Tested by building b07-pki-bundle.docx in WSL with the CI toolchain
and exporting it to PDF with Word: page 31 reads "Chapter 02 — What
AD CS Holds Up" over "Federal Modernization Workbook · Book 07 — PKI
& Certificates ... Page 31 of 181".

Co-Authored-By: Claude Opus 5.5 <noreply@anthropic.com>
</commit_message>
<xml_diff>
--- a/assets/reference-mslearn.docx
+++ b/assets/reference-mslearn.docx
@@ -302,9 +302,12 @@
       </w:r>
     </w:p>
     <w:sectPr>
+      <w:headerReference w:type="default" r:id="rIdFmwHdr"/>
+      <w:footerReference w:type="default" r:id="rIdFmwFtr"/>
       <w:footnotePr>
         <w:numRestart w:val="continuous"/>
       </w:footnotePr>
+      <w:titlePg/>
     </w:sectPr>
   </w:body>
 </w:document>
@@ -314,6 +317,74 @@
 <w:comments xmlns:w="http://schemas.openxmlformats.org/wordprocessingml/2006/main" xmlns:m="http://schemas.openxmlformats.org/officeDocument/2006/math" xmlns:r="http://schemas.openxmlformats.org/officeDocument/2006/relationships" xmlns:o="urn:schemas-microsoft-com:office:office" xmlns:v="urn:schemas-microsoft-com:vml" xmlns:w10="urn:schemas-microsoft-com:office:word" xmlns:a="http://schemas.openxmlformats.org/drawingml/2006/main" xmlns:pic="http://schemas.openxmlformats.org/drawingml/2006/picture" xmlns:wp="http://schemas.openxmlformats.org/drawingml/2006/wordprocessingDrawing"/>
 </file>
 
+<file path=word/footer1.xml><?xml version="1.0" encoding="utf-8"?>
+<w:ftr xmlns:w="http://schemas.openxmlformats.org/wordprocessingml/2006/main" xmlns:r="http://schemas.openxmlformats.org/officeDocument/2006/relationships">
+  <w:p>
+    <w:pPr>
+      <w:pStyle w:val="Footer"/>
+      <w:tabs>
+        <w:tab w:val="right" w:pos="9360"/>
+      </w:tabs>
+    </w:pPr>
+    <w:r>
+      <w:t xml:space="preserve">Federal Modernization Workbook · </w:t>
+    </w:r>
+    <w:r>
+      <w:fldChar w:fldCharType="begin"/>
+    </w:r>
+    <w:r>
+      <w:instrText xml:space="preserve"> STYLEREF "Title" \* MERGEFORMAT </w:instrText>
+    </w:r>
+    <w:r>
+      <w:fldChar w:fldCharType="separate"/>
+    </w:r>
+    <w:r>
+      <w:t xml:space="preserve">Book</w:t>
+    </w:r>
+    <w:r>
+      <w:fldChar w:fldCharType="end"/>
+    </w:r>
+    <w:r>
+      <w:tab/>
+      <w:t xml:space="preserve">Page </w:t>
+    </w:r>
+    <w:r>
+      <w:fldChar w:fldCharType="begin"/>
+    </w:r>
+    <w:r>
+      <w:instrText xml:space="preserve"> PAGE </w:instrText>
+    </w:r>
+    <w:r>
+      <w:fldChar w:fldCharType="separate"/>
+    </w:r>
+    <w:r>
+      <w:t xml:space="preserve">1</w:t>
+    </w:r>
+    <w:r>
+      <w:fldChar w:fldCharType="end"/>
+    </w:r>
+    <w:r>
+      <w:t xml:space="preserve"> of </w:t>
+    </w:r>
+    <w:r>
+      <w:fldChar w:fldCharType="begin"/>
+    </w:r>
+    <w:r>
+      <w:instrText xml:space="preserve"> NUMPAGES </w:instrText>
+    </w:r>
+    <w:r>
+      <w:fldChar w:fldCharType="separate"/>
+    </w:r>
+    <w:r>
+      <w:t xml:space="preserve">1</w:t>
+    </w:r>
+    <w:r>
+      <w:fldChar w:fldCharType="end"/>
+    </w:r>
+  </w:p>
+</w:ftr>
+</file>
+
 <file path=word/footnotes.xml><?xml version="1.0" encoding="utf-8"?>
 <w:footnotes xmlns:w="http://schemas.openxmlformats.org/wordprocessingml/2006/main" xmlns:m="http://schemas.openxmlformats.org/officeDocument/2006/math" xmlns:r="http://schemas.openxmlformats.org/officeDocument/2006/relationships" xmlns:o="urn:schemas-microsoft-com:office:office" xmlns:v="urn:schemas-microsoft-com:vml" xmlns:w10="urn:schemas-microsoft-com:office:word" xmlns:a="http://schemas.openxmlformats.org/drawingml/2006/main" xmlns:pic="http://schemas.openxmlformats.org/drawingml/2006/picture" xmlns:wp="http://schemas.openxmlformats.org/drawingml/2006/wordprocessingDrawing">
   <w:footnote w:type="continuationSeparator" w:id="0">
@@ -355,6 +426,32 @@
     </w:p>
   </w:footnote>
 </w:footnotes>
+</file>
+
+<file path=word/header1.xml><?xml version="1.0" encoding="utf-8"?>
+<w:hdr xmlns:w="http://schemas.openxmlformats.org/wordprocessingml/2006/main" xmlns:r="http://schemas.openxmlformats.org/officeDocument/2006/relationships">
+  <w:p>
+    <w:pPr>
+      <w:pStyle w:val="Header"/>
+      <w:jc w:val="right"/>
+    </w:pPr>
+    <w:r>
+      <w:fldChar w:fldCharType="begin"/>
+    </w:r>
+    <w:r>
+      <w:instrText xml:space="preserve"> STYLEREF "Heading 1" \* MERGEFORMAT </w:instrText>
+    </w:r>
+    <w:r>
+      <w:fldChar w:fldCharType="separate"/>
+    </w:r>
+    <w:r>
+      <w:t xml:space="preserve">Chapter</w:t>
+    </w:r>
+    <w:r>
+      <w:fldChar w:fldCharType="end"/>
+    </w:r>
+  </w:p>
+</w:hdr>
 </file>
 
 <file path=word/numbering.xml><?xml version="1.0" encoding="utf-8"?>
@@ -1158,6 +1255,38 @@
       <w:b w:val="0"/>
       <w:bCs w:val="0"/>
       <w:color w:val="365F91" w:themeColor="accent1" w:themeShade="BF"/>
+    </w:rPr>
+  </w:style>
+  <w:style w:type="paragraph" w:styleId="Header">
+    <w:name w:val="header"/>
+    <w:basedOn w:val="Normal"/>
+    <w:uiPriority w:val="99"/>
+    <w:unhideWhenUsed/>
+    <w:pPr>
+      <w:pBdr>
+        <w:bottom w:val="single" w:sz="4" w:space="4" w:color="CBD5E1"/>
+      </w:pBdr>
+      <w:spacing w:before="0" w:after="0"/>
+    </w:pPr>
+    <w:rPr>
+      <w:color w:val="475569"/>
+      <w:sz w:val="16"/>
+    </w:rPr>
+  </w:style>
+  <w:style w:type="paragraph" w:styleId="Footer">
+    <w:name w:val="footer"/>
+    <w:basedOn w:val="Normal"/>
+    <w:uiPriority w:val="99"/>
+    <w:unhideWhenUsed/>
+    <w:pPr>
+      <w:pBdr>
+        <w:top w:val="single" w:sz="4" w:space="4" w:color="CBD5E1"/>
+      </w:pBdr>
+      <w:spacing w:before="0" w:after="0"/>
+    </w:pPr>
+    <w:rPr>
+      <w:color w:val="475569"/>
+      <w:sz w:val="16"/>
     </w:rPr>
   </w:style>
 </w:styles>

</xml_diff>

<commit_message>
site: chapter header and page-numbered footer in every Word edition (#116)
The shared Word reference document (assets/reference-mslearn.docx),
used by the book bundles and the per-page .docx downloads, now has:
- a header with the current chapter or appendix name (a STYLEREF
  field on Heading 1, so it changes at each chapter);
- a footer with "Federal Modernization Workbook · <book title>" (a
  STYLEREF on the document Title, so it uses the book's topic name)
  and "Page X of Y";
- no header or footer on the title page.

Tested by building b07-pki-bundle.docx in WSL with the CI toolchain
and exporting it to PDF with Word: page 31 reads "Chapter 02 — What
AD CS Holds Up" over "Federal Modernization Workbook · Book 07 — PKI
& Certificates ... Page 31 of 181".

Co-authored-by: Claude Opus 5.5 <noreply@anthropic.com>
</commit_message>
<xml_diff>
--- a/assets/reference-mslearn.docx
+++ b/assets/reference-mslearn.docx
@@ -302,9 +302,12 @@
       </w:r>
     </w:p>
     <w:sectPr>
+      <w:headerReference w:type="default" r:id="rIdFmwHdr"/>
+      <w:footerReference w:type="default" r:id="rIdFmwFtr"/>
       <w:footnotePr>
         <w:numRestart w:val="continuous"/>
       </w:footnotePr>
+      <w:titlePg/>
     </w:sectPr>
   </w:body>
 </w:document>
@@ -314,6 +317,74 @@
 <w:comments xmlns:w="http://schemas.openxmlformats.org/wordprocessingml/2006/main" xmlns:m="http://schemas.openxmlformats.org/officeDocument/2006/math" xmlns:r="http://schemas.openxmlformats.org/officeDocument/2006/relationships" xmlns:o="urn:schemas-microsoft-com:office:office" xmlns:v="urn:schemas-microsoft-com:vml" xmlns:w10="urn:schemas-microsoft-com:office:word" xmlns:a="http://schemas.openxmlformats.org/drawingml/2006/main" xmlns:pic="http://schemas.openxmlformats.org/drawingml/2006/picture" xmlns:wp="http://schemas.openxmlformats.org/drawingml/2006/wordprocessingDrawing"/>
 </file>
 
+<file path=word/footer1.xml><?xml version="1.0" encoding="utf-8"?>
+<w:ftr xmlns:w="http://schemas.openxmlformats.org/wordprocessingml/2006/main" xmlns:r="http://schemas.openxmlformats.org/officeDocument/2006/relationships">
+  <w:p>
+    <w:pPr>
+      <w:pStyle w:val="Footer"/>
+      <w:tabs>
+        <w:tab w:val="right" w:pos="9360"/>
+      </w:tabs>
+    </w:pPr>
+    <w:r>
+      <w:t xml:space="preserve">Federal Modernization Workbook · </w:t>
+    </w:r>
+    <w:r>
+      <w:fldChar w:fldCharType="begin"/>
+    </w:r>
+    <w:r>
+      <w:instrText xml:space="preserve"> STYLEREF "Title" \* MERGEFORMAT </w:instrText>
+    </w:r>
+    <w:r>
+      <w:fldChar w:fldCharType="separate"/>
+    </w:r>
+    <w:r>
+      <w:t xml:space="preserve">Book</w:t>
+    </w:r>
+    <w:r>
+      <w:fldChar w:fldCharType="end"/>
+    </w:r>
+    <w:r>
+      <w:tab/>
+      <w:t xml:space="preserve">Page </w:t>
+    </w:r>
+    <w:r>
+      <w:fldChar w:fldCharType="begin"/>
+    </w:r>
+    <w:r>
+      <w:instrText xml:space="preserve"> PAGE </w:instrText>
+    </w:r>
+    <w:r>
+      <w:fldChar w:fldCharType="separate"/>
+    </w:r>
+    <w:r>
+      <w:t xml:space="preserve">1</w:t>
+    </w:r>
+    <w:r>
+      <w:fldChar w:fldCharType="end"/>
+    </w:r>
+    <w:r>
+      <w:t xml:space="preserve"> of </w:t>
+    </w:r>
+    <w:r>
+      <w:fldChar w:fldCharType="begin"/>
+    </w:r>
+    <w:r>
+      <w:instrText xml:space="preserve"> NUMPAGES </w:instrText>
+    </w:r>
+    <w:r>
+      <w:fldChar w:fldCharType="separate"/>
+    </w:r>
+    <w:r>
+      <w:t xml:space="preserve">1</w:t>
+    </w:r>
+    <w:r>
+      <w:fldChar w:fldCharType="end"/>
+    </w:r>
+  </w:p>
+</w:ftr>
+</file>
+
 <file path=word/footnotes.xml><?xml version="1.0" encoding="utf-8"?>
 <w:footnotes xmlns:w="http://schemas.openxmlformats.org/wordprocessingml/2006/main" xmlns:m="http://schemas.openxmlformats.org/officeDocument/2006/math" xmlns:r="http://schemas.openxmlformats.org/officeDocument/2006/relationships" xmlns:o="urn:schemas-microsoft-com:office:office" xmlns:v="urn:schemas-microsoft-com:vml" xmlns:w10="urn:schemas-microsoft-com:office:word" xmlns:a="http://schemas.openxmlformats.org/drawingml/2006/main" xmlns:pic="http://schemas.openxmlformats.org/drawingml/2006/picture" xmlns:wp="http://schemas.openxmlformats.org/drawingml/2006/wordprocessingDrawing">
   <w:footnote w:type="continuationSeparator" w:id="0">
@@ -355,6 +426,32 @@
     </w:p>
   </w:footnote>
 </w:footnotes>
+</file>
+
+<file path=word/header1.xml><?xml version="1.0" encoding="utf-8"?>
+<w:hdr xmlns:w="http://schemas.openxmlformats.org/wordprocessingml/2006/main" xmlns:r="http://schemas.openxmlformats.org/officeDocument/2006/relationships">
+  <w:p>
+    <w:pPr>
+      <w:pStyle w:val="Header"/>
+      <w:jc w:val="right"/>
+    </w:pPr>
+    <w:r>
+      <w:fldChar w:fldCharType="begin"/>
+    </w:r>
+    <w:r>
+      <w:instrText xml:space="preserve"> STYLEREF "Heading 1" \* MERGEFORMAT </w:instrText>
+    </w:r>
+    <w:r>
+      <w:fldChar w:fldCharType="separate"/>
+    </w:r>
+    <w:r>
+      <w:t xml:space="preserve">Chapter</w:t>
+    </w:r>
+    <w:r>
+      <w:fldChar w:fldCharType="end"/>
+    </w:r>
+  </w:p>
+</w:hdr>
 </file>
 
 <file path=word/numbering.xml><?xml version="1.0" encoding="utf-8"?>
@@ -1158,6 +1255,38 @@
       <w:b w:val="0"/>
       <w:bCs w:val="0"/>
       <w:color w:val="365F91" w:themeColor="accent1" w:themeShade="BF"/>
+    </w:rPr>
+  </w:style>
+  <w:style w:type="paragraph" w:styleId="Header">
+    <w:name w:val="header"/>
+    <w:basedOn w:val="Normal"/>
+    <w:uiPriority w:val="99"/>
+    <w:unhideWhenUsed/>
+    <w:pPr>
+      <w:pBdr>
+        <w:bottom w:val="single" w:sz="4" w:space="4" w:color="CBD5E1"/>
+      </w:pBdr>
+      <w:spacing w:before="0" w:after="0"/>
+    </w:pPr>
+    <w:rPr>
+      <w:color w:val="475569"/>
+      <w:sz w:val="16"/>
+    </w:rPr>
+  </w:style>
+  <w:style w:type="paragraph" w:styleId="Footer">
+    <w:name w:val="footer"/>
+    <w:basedOn w:val="Normal"/>
+    <w:uiPriority w:val="99"/>
+    <w:unhideWhenUsed/>
+    <w:pPr>
+      <w:pBdr>
+        <w:top w:val="single" w:sz="4" w:space="4" w:color="CBD5E1"/>
+      </w:pBdr>
+      <w:spacing w:before="0" w:after="0"/>
+    </w:pPr>
+    <w:rPr>
+      <w:color w:val="475569"/>
+      <w:sz w:val="16"/>
     </w:rPr>
   </w:style>
 </w:styles>

</xml_diff>

<commit_message>
site: smaller type for large tables so their columns balance
Word editions: landscape tables, tables of 6 or more columns and text-heavy
tables set their cells in a new "Table Small" character style (10 pt;
body text is 12 pt), and the width rule balances their columns for the
extra room. On the Book 07 bundle the use-case map and the ESC table
have no mid-word breaks, landscape pages fell from 23 to 16 and the
bundle from 171 to 162 pages.

Website: tables of 6 or more columns use slightly smaller text on
screens wider than a phone.

Co-Authored-By: Claude Opus 5.5 <noreply@anthropic.com>
</commit_message>
<xml_diff>
--- a/assets/reference-mslearn.docx
+++ b/assets/reference-mslearn.docx
@@ -1287,6 +1287,14 @@
     <w:rPr>
       <w:color w:val="475569"/>
       <w:sz w:val="16"/>
+    </w:rPr>
+  </w:style>
+  <w:style w:type="character" w:customStyle="1" w:styleId="TableSmall">
+    <w:name w:val="Table Small"/>
+    <w:uiPriority w:val="99"/>
+    <w:rPr>
+      <w:sz w:val="20"/>
+      <w:szCs w:val="20"/>
     </w:rPr>
   </w:style>
 </w:styles>

</xml_diff>

<commit_message>
site: smaller type for large tables so their columns balance (#119)
Word editions: landscape tables, tables of 6 or more columns and text-heavy
tables set their cells in a new "Table Small" character style (10 pt;
body text is 12 pt), and the width rule balances their columns for the
extra room. On the Book 07 bundle the use-case map and the ESC table
have no mid-word breaks, landscape pages fell from 23 to 16 and the
bundle from 171 to 162 pages.

Website: tables of 6 or more columns use slightly smaller text on
screens wider than a phone.

Co-authored-by: Claude Opus 5.5 <noreply@anthropic.com>
</commit_message>
<xml_diff>
--- a/assets/reference-mslearn.docx
+++ b/assets/reference-mslearn.docx
@@ -1287,6 +1287,14 @@
     <w:rPr>
       <w:color w:val="475569"/>
       <w:sz w:val="16"/>
+    </w:rPr>
+  </w:style>
+  <w:style w:type="character" w:customStyle="1" w:styleId="TableSmall">
+    <w:name w:val="Table Small"/>
+    <w:uiPriority w:val="99"/>
+    <w:rPr>
+      <w:sz w:val="20"/>
+      <w:szCs w:val="20"/>
     </w:rPr>
   </w:style>
 </w:styles>

</xml_diff>